<commit_message>
Form Fill: metadata fixes
</commit_message>
<xml_diff>
--- a/examples/form-fill/targets/w9-request-letter.docx
+++ b/examples/form-fill/targets/w9-request-letter.docx
@@ -33,7 +33,9 @@
     </w:p>
     <w:p>
       <w:r>
-        <w:t>{{Business Name}}</w:t>
+        <w:t>{{Legal Entity Name}}</w:t>
+        <w:br/>
+        <w:t>{{DBA/Disregarded Entity Name}}</w:t>
       </w:r>
     </w:p>
     <w:p>

</xml_diff>